<commit_message>
fill A2 form with measured evidence
</commit_message>
<xml_diff>
--- a/forms/A2_form.docx
+++ b/forms/A2_form.docx
@@ -137,6 +137,9 @@
             <w:r>
               <w:t xml:space="preserve"/>
             </w:r>
+            <w:r>
+              <w:t xml:space="preserve">Bangla Morphological Analyzer (BMA)</w:t>
+            </w:r>
           </w:p>
         </w:tc>
       </w:tr>
@@ -583,6 +586,9 @@
             <w:r>
               <w:t xml:space="preserve"/>
             </w:r>
+            <w:r>
+              <w:t xml:space="preserve">Domain: Bangla grammar/morphology; speciality: conjuncts, matras, hasanta, reph, nukta, Bengali digits and rule notation; primary NFR: explainable, with rule-attribution coverage &gt;= 0.90.</w:t>
+            </w:r>
           </w:p>
         </w:tc>
       </w:tr>
@@ -631,6 +637,9 @@
             <w:r>
               <w:t xml:space="preserve"/>
             </w:r>
+            <w:r>
+              <w:t xml:space="preserve">Answer-F1 &gt;= 0.70 on the verifiable task subset (carried unchanged from A1).</w:t>
+            </w:r>
           </w:p>
         </w:tc>
       </w:tr>
@@ -678,6 +687,9 @@
             </w:pPr>
             <w:r>
               <w:t xml:space="preserve"/>
+            </w:r>
+            <w:r>
+              <w:t xml:space="preserve">Private/link-only corpus: 1942 Bhasha-prakash Bangala Byakaran (565 pages) plus NCTB Bangla Grammar Classes 9–10 (2026, 218 pages). Kaggle measured 783 total pages, 775 usable/OCR-covered pages and 195,803 usable OCR words. The A1 2019 NCTB edition was revised to the available 2026 edition and must be disclosed/approved.</w:t>
             </w:r>
           </w:p>
         </w:tc>
@@ -775,6 +787,9 @@
             <w:r>
               <w:t xml:space="preserve"/>
             </w:r>
+            <w:r>
+              <w:t xml:space="preserve">Nearby pixels form strokes and aligned text lines; projection profiles and connected ink support bounded regions, reading order, and table detection.</w:t>
+            </w:r>
           </w:p>
         </w:tc>
       </w:tr>
@@ -823,6 +838,9 @@
             <w:r>
               <w:t xml:space="preserve"/>
             </w:r>
+            <w:r>
+              <w:t xml:space="preserve">Reading order and surrounding Bangla context carry meaning; conjuncts, matras, hasanta and rule/example structure must remain together for OCR and retrieval.</w:t>
+            </w:r>
           </w:p>
         </w:tc>
       </w:tr>
@@ -870,6 +888,9 @@
             </w:pPr>
             <w:r>
               <w:t xml:space="preserve"/>
+            </w:r>
+            <w:r>
+              <w:t xml:space="preserve">Page position, font variation, mild skew, scan noise and ink bleed should not change the answer; provenance and meaning should remain stable.</w:t>
             </w:r>
           </w:p>
         </w:tc>
@@ -1053,6 +1074,9 @@
             <w:r>
               <w:t xml:space="preserve"/>
             </w:r>
+            <w:r>
+              <w:t xml:space="preserve">Compared classical preprocessing/denoise choices; chose deterministic Pillow/NumPy projection-profile enhancement and conservative normalization for reproducibility and glyph safety.</w:t>
+            </w:r>
           </w:p>
         </w:tc>
         <w:tc>
@@ -1114,6 +1138,9 @@
             <w:r>
               <w:t xml:space="preserve"/>
             </w:r>
+            <w:r>
+              <w:t xml:space="preserve">Compared heuristic layout with a learned detector; chose deterministic projection-profile regions, merged line runs, table grouping and reading-order rules because the corpus is small and provenance-critical.</w:t>
+            </w:r>
           </w:p>
         </w:tc>
         <w:tc>
@@ -1175,6 +1202,9 @@
             <w:r>
               <w:t xml:space="preserve"/>
             </w:r>
+            <w:r>
+              <w:t xml:space="preserve">Compared EasyOCR with the retained Qwen3-VL drafts; chose pretrained EasyOCR 1.7.2 (bn+en), which is reproducible and measured on held-out pages without using the PDF text layer.</w:t>
+            </w:r>
           </w:p>
         </w:tc>
         <w:tc>
@@ -1187,6 +1217,9 @@
             </w:pPr>
             <w:r>
               <w:t xml:space="preserve"/>
+            </w:r>
+            <w:r>
+              <w:t xml:space="preserve">Yes — EasyOCR 1.7.2 pretrained method reproduced/adapted.</w:t>
             </w:r>
           </w:p>
         </w:tc>
@@ -1236,6 +1269,9 @@
             <w:r>
               <w:t xml:space="preserve"/>
             </w:r>
+            <w:r>
+              <w:t xml:space="preserve">Compared fixed 256-token/32-overlap chunks with rule-aware structural chunks; selected rule-aware for the full index (1,910 chunks; Hit@5 0.5, tied with fixed).</w:t>
+            </w:r>
           </w:p>
         </w:tc>
         <w:tc>
@@ -1297,6 +1333,9 @@
             <w:r>
               <w:t xml:space="preserve"/>
             </w:r>
+            <w:r>
+              <w:t xml:space="preserve">Compared BGE-M3 with paraphrase-multilingual-MiniLM-L12-v2; selected pretrained BAAI/bge-m3 (1024D). BGE-M3 Hit@5 0.5 versus lightweight 0.0.</w:t>
+            </w:r>
           </w:p>
         </w:tc>
         <w:tc>
@@ -1309,6 +1348,9 @@
             </w:pPr>
             <w:r>
               <w:t xml:space="preserve"/>
+            </w:r>
+            <w:r>
+              <w:t xml:space="preserve">Yes — pretrained BGE-M3 reproduced/adapted.</w:t>
             </w:r>
           </w:p>
         </w:tc>
@@ -1357,6 +1399,9 @@
             </w:pPr>
             <w:r>
               <w:t xml:space="preserve"/>
+            </w:r>
+            <w:r>
+              <w:t xml:space="preserve">Compared exact FlatIP with approximate alternatives; chose FAISS IndexFlatIP after L2 normalization for deterministic exact search and restart-safe metadata.</w:t>
             </w:r>
           </w:p>
         </w:tc>
@@ -1530,6 +1575,9 @@
             <w:r>
               <w:t xml:space="preserve"/>
             </w:r>
+            <w:r>
+              <w:t xml:space="preserve">Pillow/NumPy classical pipeline</w:t>
+            </w:r>
           </w:p>
         </w:tc>
         <w:tc>
@@ -1543,6 +1591,9 @@
             <w:r>
               <w:t xml:space="preserve"/>
             </w:r>
+            <w:r>
+              <w:t xml:space="preserve">Projection deskew, median denoise, Otsu; stable page IDs and artifact paths.</w:t>
+            </w:r>
           </w:p>
         </w:tc>
         <w:tc>
@@ -1556,6 +1607,9 @@
             <w:r>
               <w:t xml:space="preserve"/>
             </w:r>
+            <w:r>
+              <w:t xml:space="preserve">Scratch/deterministic classical processing</w:t>
+            </w:r>
           </w:p>
         </w:tc>
       </w:tr>
@@ -1584,6 +1638,9 @@
             <w:r>
               <w:t xml:space="preserve"/>
             </w:r>
+            <w:r>
+              <w:t xml:space="preserve">Pillow/NumPy projection-profile layout</w:t>
+            </w:r>
           </w:p>
         </w:tc>
         <w:tc>
@@ -1597,6 +1654,9 @@
             <w:r>
               <w:t xml:space="preserve"/>
             </w:r>
+            <w:r>
+              <w:t xml:space="preserve">Bounded regions, line merging, table grouping, reading order.</w:t>
+            </w:r>
           </w:p>
         </w:tc>
         <w:tc>
@@ -1610,6 +1670,9 @@
             <w:r>
               <w:t xml:space="preserve"/>
             </w:r>
+            <w:r>
+              <w:t xml:space="preserve">Scratch/deterministic heuristic</w:t>
+            </w:r>
           </w:p>
         </w:tc>
       </w:tr>
@@ -1638,6 +1701,9 @@
             <w:r>
               <w:t xml:space="preserve"/>
             </w:r>
+            <w:r>
+              <w:t xml:space="preserve">EasyOCR 1.7.2 (bn+en)</w:t>
+            </w:r>
           </w:p>
         </w:tc>
         <w:tc>
@@ -1651,6 +1717,9 @@
             <w:r>
               <w:t xml:space="preserve"/>
             </w:r>
+            <w:r>
+              <w:t xml:space="preserve">Lazy reader; ordered regions; NFC and conservative whitespace normalization.</w:t>
+            </w:r>
           </w:p>
         </w:tc>
         <w:tc>
@@ -1664,6 +1733,9 @@
             <w:r>
               <w:t xml:space="preserve"/>
             </w:r>
+            <w:r>
+              <w:t xml:space="preserve">Pretrained, not fine-tuned</w:t>
+            </w:r>
           </w:p>
         </w:tc>
       </w:tr>
@@ -1692,6 +1764,9 @@
             <w:r>
               <w:t xml:space="preserve"/>
             </w:r>
+            <w:r>
+              <w:t xml:space="preserve">Rule-aware structural chunker</w:t>
+            </w:r>
           </w:p>
         </w:tc>
         <w:tc>
@@ -1705,6 +1780,9 @@
             <w:r>
               <w:t xml:space="preserve"/>
             </w:r>
+            <w:r>
+              <w:t xml:space="preserve">Preserves headings, numbered rules, examples and tables; fixed baseline 256/32 retained for comparison.</w:t>
+            </w:r>
           </w:p>
         </w:tc>
         <w:tc>
@@ -1718,6 +1796,9 @@
             <w:r>
               <w:t xml:space="preserve"/>
             </w:r>
+            <w:r>
+              <w:t xml:space="preserve">Scratch deterministic chunking</w:t>
+            </w:r>
           </w:p>
         </w:tc>
       </w:tr>
@@ -1746,6 +1827,9 @@
             <w:r>
               <w:t xml:space="preserve"/>
             </w:r>
+            <w:r>
+              <w:t xml:space="preserve">BAAI/bge-m3</w:t>
+            </w:r>
           </w:p>
         </w:tc>
         <w:tc>
@@ -1759,6 +1843,9 @@
             <w:r>
               <w:t xml:space="preserve"/>
             </w:r>
+            <w:r>
+              <w:t xml:space="preserve">1024 dimensions; batch 32; CUDA in Kaggle; L2-normalized vectors.</w:t>
+            </w:r>
           </w:p>
         </w:tc>
         <w:tc>
@@ -1772,6 +1859,9 @@
             <w:r>
               <w:t xml:space="preserve"/>
             </w:r>
+            <w:r>
+              <w:t xml:space="preserve">Pretrained, not fine-tuned</w:t>
+            </w:r>
           </w:p>
         </w:tc>
       </w:tr>
@@ -1800,6 +1890,9 @@
             <w:r>
               <w:t xml:space="preserve"/>
             </w:r>
+            <w:r>
+              <w:t xml:space="preserve">FAISS IndexFlatIP</w:t>
+            </w:r>
           </w:p>
         </w:tc>
         <w:tc>
@@ -1813,6 +1906,9 @@
             <w:r>
               <w:t xml:space="preserve"/>
             </w:r>
+            <w:r>
+              <w:t xml:space="preserve">1,910 chunks; exact inner-product search; JSON metadata; atomic save/load and fresh-process reload.</w:t>
+            </w:r>
           </w:p>
         </w:tc>
         <w:tc>
@@ -1825,6 +1921,9 @@
             </w:pPr>
             <w:r>
               <w:t xml:space="preserve"/>
+            </w:r>
+            <w:r>
+              <w:t xml:space="preserve">Scratch configuration around pretrained vectors</w:t>
             </w:r>
           </w:p>
         </w:tc>
@@ -1890,6 +1989,9 @@
             </w:pPr>
             <w:r>
               <w:t xml:space="preserve"/>
+            </w:r>
+            <w:r>
+              <w:t xml:space="preserve">Pages → ingest/clean → deterministic enhancement → layout → EasyOCR → rule-aware chunk → BGE-M3 embed → L2 normalize → FAISS FlatIP + provenance metadata. The A2 implementation adds conservative enhancement, structural chunking, exact model comparison and restart verification.</w:t>
             </w:r>
           </w:p>
         </w:tc>
@@ -1987,6 +2089,9 @@
             <w:r>
               <w:t xml:space="preserve"/>
             </w:r>
+            <w:r>
+              <w:t xml:space="preserve">EasyOCR held-out sample: normalized CER 0.1791 and normalized WER 0.5063; 12 labelled pages. Stored candidate comparison: CER 0.1208, WER 0.2685. Worst page: bhasha_prakash_1942_p0410.</w:t>
+            </w:r>
           </w:p>
         </w:tc>
       </w:tr>
@@ -2035,6 +2140,9 @@
             <w:r>
               <w:t xml:space="preserve"/>
             </w:r>
+            <w:r>
+              <w:t xml:space="preserve">Selected full index: 1,910 chunks, 1024D, FAISS FlatIP; 775/783 pages indexed/usable and 195,803 usable OCR words. FAISS bytes 7,823,405; metadata 3,327,348 bytes; selected build 157.75 seconds.</w:t>
+            </w:r>
           </w:p>
         </w:tc>
       </w:tr>
@@ -2083,6 +2191,9 @@
             <w:r>
               <w:t xml:space="preserve"/>
             </w:r>
+            <w:r>
+              <w:t xml:space="preserve">Query: ‘স্বরধ্বনি কাকে বলে?’ Top result: NCTB page nctb_bangla_grammar_2026_p0020, score 0.5905; its text directly defines স্বরধ্বনি, so manual semantic judgment PASS. The expected historical page was not in top five, documenting a provenance-recall limitation.</w:t>
+            </w:r>
           </w:p>
         </w:tc>
       </w:tr>
@@ -2130,6 +2241,9 @@
             </w:pPr>
             <w:r>
               <w:t xml:space="preserve"/>
+            </w:r>
+            <w:r>
+              <w:t xml:space="preserve">Worst retrieval: ‘যুক্তবর্ণের উদাহরণ কী?’ expected bhasha_prakash_1942_p0090 was absent from top five; unrelated NCTB chunks ranked first. Likely causes are OCR noise, two-document/domain shift and limited query set; A3 should add reranking, evidence-gated widening and abstention.</w:t>
             </w:r>
           </w:p>
         </w:tc>
@@ -2232,6 +2346,9 @@
             <w:r>
               <w:t xml:space="preserve"/>
             </w:r>
+            <w:r>
+              <w:t xml:space="preserve">Build A3 retrieval and reranking around the measured BGE-M3/FAISS base: add a cross-encoder or lexical reranker, evidence-gated re-search with widening k, citation checks, and fail-closed abstention at k_max. Evaluate answer-F1 and citation/rule-attribution coverage.</w:t>
+            </w:r>
           </w:p>
         </w:tc>
       </w:tr>
@@ -2280,6 +2397,9 @@
             <w:r>
               <w:t xml:space="preserve"/>
             </w:r>
+            <w:r>
+              <w:t xml:space="preserve">Create domain tasks from Bangla grammar definitions, rules, examples and morphology questions, with expected answer text, source page IDs, difficulty, and abstention cases. Keep train/validation/test separated by document/chapter where possible.</w:t>
+            </w:r>
           </w:p>
         </w:tc>
       </w:tr>
@@ -2327,6 +2447,9 @@
             </w:pPr>
             <w:r>
               <w:t xml:space="preserve"/>
+            </w:r>
+            <w:r>
+              <w:t xml:space="preserve">The main risk is OCR and retrieval error on historical conjuncts and document shift: the worst query missed its expected page. First response: preserve raw OCR, add reranking/query expansion, monitor page-level recall and abstain when evidence is weak.</w:t>
             </w:r>
           </w:p>
         </w:tc>
@@ -2480,6 +2603,9 @@
               </w:rPr>
               <w:t xml:space="preserve">what these stages must achieve + success metric</w:t>
             </w:r>
+            <w:r>
+              <w:t xml:space="preserve">Stages 1–4 turn scanned Bangla pages into cited answers; A1 answer-F1 target &gt;=0.70, plus explainability targets.</w:t>
+            </w:r>
           </w:p>
         </w:tc>
         <w:tc>
@@ -2500,6 +2626,9 @@
               </w:rPr>
               <w:t xml:space="preserve">why this · its cost · what would change our mind</w:t>
             </w:r>
+            <w:r>
+              <w:t xml:space="preserve">Keeps the A1 contract; costs extra provenance and evaluation work; change only with instructor approval.</w:t>
+            </w:r>
           </w:p>
         </w:tc>
       </w:tr>
@@ -2535,6 +2664,9 @@
               </w:rPr>
               <w:t xml:space="preserve">inputs, formats, splits, any labels used</w:t>
             </w:r>
+            <w:r>
+              <w:t xml:space="preserve">Private/link-only 1942 and 2026 PDFs; 783 pages, 775 usable, 195,803 OCR words; held-out labels/pages for evaluation.</w:t>
+            </w:r>
           </w:p>
         </w:tc>
         <w:tc>
@@ -2555,6 +2687,9 @@
               </w:rPr>
               <w:t xml:space="preserve">why this · its cost · what would change our mind</w:t>
             </w:r>
+            <w:r>
+              <w:t xml:space="preserve">Matches real corpus difficulty and rights; limits public reproducibility; a new corpus version would require remeasurement.</w:t>
+            </w:r>
           </w:p>
         </w:tc>
       </w:tr>
@@ -2590,6 +2725,9 @@
               </w:rPr>
               <w:t xml:space="preserve">checkpoints chosen per stage</w:t>
             </w:r>
+            <w:r>
+              <w:t xml:space="preserve">Classical deterministic ingest/layout; EasyOCR 1.7.2; BGE-M3; FAISS FlatIP.</w:t>
+            </w:r>
           </w:p>
         </w:tc>
         <w:tc>
@@ -2610,6 +2748,9 @@
               </w:rPr>
               <w:t xml:space="preserve">why this · its cost · what would change our mind</w:t>
             </w:r>
+            <w:r>
+              <w:t xml:space="preserve">Pretrained models reduce training data needs; model downloads and GPU memory cost; measured comparison can change the selection.</w:t>
+            </w:r>
           </w:p>
         </w:tc>
       </w:tr>
@@ -2645,6 +2786,9 @@
               </w:rPr>
               <w:t xml:space="preserve">fine-tuning / inference technique, key hyperparameters</w:t>
             </w:r>
+            <w:r>
+              <w:t xml:space="preserve">Projection profiles, conservative normalization, structural rule-aware chunks, batch-32 embeddings, L2 normalization, exact inner-product search.</w:t>
+            </w:r>
           </w:p>
         </w:tc>
         <w:tc>
@@ -2665,6 +2809,9 @@
               </w:rPr>
               <w:t xml:space="preserve">why this · its cost · what would change our mind</w:t>
             </w:r>
+            <w:r>
+              <w:t xml:space="preserve">Preserves grammar units and citations; rule-aware index is larger; reranking is the next improvement after the observed miss.</w:t>
+            </w:r>
           </w:p>
         </w:tc>
       </w:tr>
@@ -2700,6 +2847,9 @@
               </w:rPr>
               <w:t xml:space="preserve">how the stages connect (the data contracts)</w:t>
             </w:r>
+            <w:r>
+              <w:t xml:space="preserve">Page → Region → OCR text → Chunk with page IDs → normalized vector → FAISS + JSON metadata.</w:t>
+            </w:r>
           </w:p>
         </w:tc>
         <w:tc>
@@ -2720,6 +2870,9 @@
               </w:rPr>
               <w:t xml:space="preserve">why this · its cost · what would change our mind</w:t>
             </w:r>
+            <w:r>
+              <w:t xml:space="preserve">Stable contracts make reload and citation checking possible; stricter metadata validation costs implementation complexity.</w:t>
+            </w:r>
           </w:p>
         </w:tc>
       </w:tr>
@@ -2755,6 +2908,9 @@
               </w:rPr>
               <w:t xml:space="preserve">tests, config, experiment logging</w:t>
             </w:r>
+            <w:r>
+              <w:t xml:space="preserve">Focused pytest suite, Kaggle run on commit 711c044, fixed four-query comparison, saved metrics and worst failure.</w:t>
+            </w:r>
           </w:p>
         </w:tc>
         <w:tc>
@@ -2775,6 +2931,9 @@
               </w:rPr>
               <w:t xml:space="preserve">why this · its cost · what would change our mind</w:t>
             </w:r>
+            <w:r>
+              <w:t xml:space="preserve">Evidence is reproducible and honest; four queries are small, so A3 needs a larger task set.</w:t>
+            </w:r>
           </w:p>
         </w:tc>
       </w:tr>
@@ -2810,6 +2969,9 @@
               </w:rPr>
               <w:t xml:space="preserve">how indexing runs (batch, device, memory)</w:t>
             </w:r>
+            <w:r>
+              <w:t xml:space="preserve">Batch index build in Kaggle CUDA working storage; 1,910 chunks, 1024D, 157.75 s selected build, fresh-process reload pass.</w:t>
+            </w:r>
           </w:p>
         </w:tc>
         <w:tc>
@@ -2830,6 +2992,9 @@
               </w:rPr>
               <w:t xml:space="preserve">why this · its cost · what would change our mind</w:t>
             </w:r>
+            <w:r>
+              <w:t xml:space="preserve">Exact FlatIP is reliable at this scale; larger corpora may require HNSW/IVF after recall benchmarking.</w:t>
+            </w:r>
           </w:p>
         </w:tc>
       </w:tr>
@@ -2865,6 +3030,9 @@
               </w:rPr>
               <w:t xml:space="preserve">corpus versioning, what you'd monitor</w:t>
             </w:r>
+            <w:r>
+              <w:t xml:space="preserve">Version corpus hashes, tested commit, model/config, index dimension/count, build timings, OCR errors and retrieval Hit@5.</w:t>
+            </w:r>
           </w:p>
         </w:tc>
         <w:tc>
@@ -2884,6 +3052,9 @@
                 <w:szCs w:val="18"/>
               </w:rPr>
               <w:t xml:space="preserve">why this · its cost · what would change our mind</w:t>
+            </w:r>
+            <w:r>
+              <w:t xml:space="preserve">Makes drift and regressions visible; monitoring requires retaining representative labelled queries and rights-safe artifacts.</w:t>
             </w:r>
           </w:p>
         </w:tc>

</xml_diff>

<commit_message>
final adding of A2 form
</commit_message>
<xml_diff>
--- a/forms/A2_form.docx
+++ b/forms/A2_form.docx
@@ -297,6 +297,9 @@
             <w:r>
               <w:t xml:space="preserve"/>
             </w:r>
+            <w:r>
+              <w:t xml:space="preserve">Nahid Hossain Redom</w:t>
+            </w:r>
           </w:p>
         </w:tc>
         <w:tc>
@@ -310,6 +313,9 @@
             <w:r>
               <w:t xml:space="preserve"/>
             </w:r>
+            <w:r>
+              <w:t xml:space="preserve">2105001</w:t>
+            </w:r>
           </w:p>
         </w:tc>
         <w:tc>
@@ -323,6 +329,9 @@
             <w:r>
               <w:t xml:space="preserve"/>
             </w:r>
+            <w:r>
+              <w:t xml:space="preserve">Sections 2; 3 (layout, OCR, chunking); 4 (layout, OCR, chunking implementation); 5 (OCR quality and corpus coverage); 7 (Stages 2–3 and chunking); 8 (individual transcript).</w:t>
+            </w:r>
           </w:p>
         </w:tc>
       </w:tr>
@@ -351,6 +360,9 @@
             <w:r>
               <w:t xml:space="preserve"/>
             </w:r>
+            <w:r>
+              <w:t xml:space="preserve">Fahim Ishtiak</w:t>
+            </w:r>
           </w:p>
         </w:tc>
         <w:tc>
@@ -364,6 +376,9 @@
             <w:r>
               <w:t xml:space="preserve"/>
             </w:r>
+            <w:r>
+              <w:t xml:space="preserve">2105004</w:t>
+            </w:r>
           </w:p>
         </w:tc>
         <w:tc>
@@ -377,6 +392,9 @@
             <w:r>
               <w:t xml:space="preserve"/>
             </w:r>
+            <w:r>
+              <w:t xml:space="preserve">Sections 1; 2; 3 (ingest/preprocessing and OCR options); 7 (Stage 1); 8 (individual transcript). Also corpus/provenance, held-out labels, preprocessing, and validation evidence.</w:t>
+            </w:r>
           </w:p>
         </w:tc>
       </w:tr>
@@ -405,6 +423,9 @@
             <w:r>
               <w:t xml:space="preserve"/>
             </w:r>
+            <w:r>
+              <w:t xml:space="preserve">Md Junaid Ahmmad</w:t>
+            </w:r>
           </w:p>
         </w:tc>
         <w:tc>
@@ -418,6 +439,9 @@
             <w:r>
               <w:t xml:space="preserve"/>
             </w:r>
+            <w:r>
+              <w:t xml:space="preserve">2105006</w:t>
+            </w:r>
           </w:p>
         </w:tc>
         <w:tc>
@@ -430,6 +454,9 @@
             </w:pPr>
             <w:r>
               <w:t xml:space="preserve"/>
+            </w:r>
+            <w:r>
+              <w:t xml:space="preserve">Sections 4 (embedding and FAISS); 5 (index and retrieval evidence); 6 (A3 plan from retrieval findings); 7 (Stage 4); 8 (individual transcript). Also CI/security and Kaggle index evidence.</w:t>
             </w:r>
           </w:p>
         </w:tc>

</xml_diff>